<commit_message>
Simplify v2 slide 7 to the paired effect size; drop GLM/matrix framing
Reworks v2 slide 7 from the GLM/design-matrix lens to the report's
actual analysis: signed change D, Delta = mean(D) = (247-4)/440 =
+55.2 pp, and why the design is paired. Removes the design-matrix
appendix and renumbers the rest (A1 tests, A2 power, A3 category;
GLM row dropped from the test table). Speaking notes synced to match
(slide-7 script, Q&A, learning-objective map, per-student focus).

Co-Authored-By: Claude Opus 4.8 <noreply@anthropic.com>
</commit_message>
<xml_diff>
--- a/defense_presentation/v2/Refusal_Ablation_Defense_v2_Speaking_Notes.docx
+++ b/defense_presentation/v2/Refusal_Ablation_Defense_v2_Speaking_Notes.docx
@@ -510,7 +510,7 @@
                 <w:color w:val="1B2A45"/>
                 <w:sz w:val="20"/>
               </w:rPr>
-              <w:t>Statistical model + matrix/GLM, tests &amp; assumptions, result</w:t>
+              <w:t>Effect size, tests &amp; assumptions, result</w:t>
             </w:r>
           </w:p>
         </w:tc>
@@ -531,7 +531,7 @@
                 <w:color w:val="1B2A45"/>
                 <w:sz w:val="20"/>
               </w:rPr>
-              <w:t>~1:57</w:t>
+              <w:t>~1:51</w:t>
             </w:r>
           </w:p>
         </w:tc>
@@ -631,7 +631,7 @@
           <w:color w:val="6A7890"/>
           <w:sz w:val="20"/>
         </w:rPr>
-        <w:t>Appendix A1–A4 are backup slides for the individual questioning (design matrix, test-choice table, power derivation, category/fairness detail).</w:t>
+        <w:t>Appendix A1–A3 are backup slides for the individual questioning (test-choice table, power derivation, category/fairness detail).</w:t>
       </w:r>
     </w:p>
     <w:p>
@@ -1067,7 +1067,7 @@
           <w:color w:val="1B2A45"/>
           <w:sz w:val="25"/>
         </w:rPr>
-        <w:t xml:space="preserve">   ·   Step 5 — the statistical model</w:t>
+        <w:t xml:space="preserve">   ·   Step 5 — the effect size</w:t>
       </w:r>
     </w:p>
     <w:p>
@@ -1093,7 +1093,7 @@
           <w:color w:val="6A7890"/>
           <w:sz w:val="19"/>
         </w:rPr>
-        <w:t xml:space="preserve">   ·   0:42</w:t>
+        <w:t xml:space="preserve">   ·   0:36</w:t>
       </w:r>
     </w:p>
     <w:p>
@@ -1108,7 +1108,7 @@
           <w:color w:val="1B2A45"/>
           <w:sz w:val="22"/>
         </w:rPr>
-        <w:t>We write the evaluation as a model. Per prompt the signed change D is edited minus baseline, in minus-one, zero, plus-one, and the effect size is the mean of D. More generally it's a generalized linear model: logit of compliance equals a design matrix times beta, with columns for condition, category, and their interaction. Beta-one is the main edit effect — our A/B treatment effect; the interaction terms let the effect vary by category. So we have model set-up, the matrix formulation, and interactions in one place.</w:t>
+        <w:t>We turn the change into one number. Per prompt the signed change D is edited minus baseline — plus one if a refusal becomes compliance, minus one the other way, zero if nothing changes — and the effect size is just the mean of D. That mean is the headline directly: 247 prompts flip to compliance and only four flip back, so it's 247 minus 4 over 440, which is plus 55.2 points. Because the design is paired, each prompt is its own control, and the next slide tests whether that change is statistically real.</w:t>
       </w:r>
     </w:p>
     <w:p>
@@ -1851,7 +1851,7 @@
                 <w:color w:val="1B2A45"/>
                 <w:sz w:val="20"/>
               </w:rPr>
-              <w:t>Category plots + paired tests, assumptions, CIs, bootstrap uncertainty (slides 7–11, A1–A4).</w:t>
+              <w:t>Category plots + paired tests, assumptions, CIs, bootstrap uncertainty (slides 7–11, A1–A3).</w:t>
             </w:r>
           </w:p>
         </w:tc>
@@ -2002,7 +2002,7 @@
                 <w:color w:val="1B2A45"/>
                 <w:sz w:val="19"/>
               </w:rPr>
-              <w:t>S3, S7, A1</w:t>
+              <w:t>S3, S7</w:t>
             </w:r>
           </w:p>
         </w:tc>
@@ -2023,134 +2023,7 @@
                 <w:color w:val="1B2A45"/>
                 <w:sz w:val="19"/>
               </w:rPr>
-              <w:t>Paired A/B + GLM for SORRY-Bench compliance.</w:t>
-            </w:r>
-          </w:p>
-        </w:tc>
-      </w:tr>
-      <w:tr>
-        <w:tc>
-          <w:tcPr>
-            <w:tcW w:type="dxa" w:w="5040"/>
-          </w:tcPr>
-          <w:p>
-            <w:pPr>
-              <w:spacing w:after="40" w:before="40"/>
-            </w:pPr>
-            <w:r>
-              <w:rPr>
-                <w:rFonts w:ascii="Calibri" w:hAnsi="Calibri"/>
-                <w:b/>
-                <w:i w:val="0"/>
-                <w:color w:val="29457F"/>
-                <w:sz w:val="20"/>
-              </w:rPr>
-              <w:t>Matrix formulation of simple models</w:t>
-            </w:r>
-          </w:p>
-        </w:tc>
-        <w:tc>
-          <w:tcPr>
-            <w:tcW w:type="dxa" w:w="1728"/>
-          </w:tcPr>
-          <w:p>
-            <w:pPr>
-              <w:spacing w:after="40" w:before="40"/>
-            </w:pPr>
-            <w:r>
-              <w:rPr>
-                <w:rFonts w:ascii="Calibri" w:hAnsi="Calibri"/>
-                <w:b w:val="0"/>
-                <w:i w:val="0"/>
-                <w:color w:val="1B2A45"/>
-                <w:sz w:val="19"/>
-              </w:rPr>
-              <w:t>S7, A1</w:t>
-            </w:r>
-          </w:p>
-        </w:tc>
-        <w:tc>
-          <w:tcPr>
-            <w:tcW w:type="dxa" w:w="5904"/>
-          </w:tcPr>
-          <w:p>
-            <w:pPr>
-              <w:spacing w:after="40" w:before="40"/>
-            </w:pPr>
-            <w:r>
-              <w:rPr>
-                <w:rFonts w:ascii="Calibri" w:hAnsi="Calibri"/>
-                <w:b w:val="0"/>
-                <w:i w:val="0"/>
-                <w:color w:val="1B2A45"/>
-                <w:sz w:val="19"/>
-              </w:rPr>
-              <w:t>η = Xβ; design matrix with condition/category/interaction.</w:t>
-            </w:r>
-          </w:p>
-        </w:tc>
-      </w:tr>
-      <w:tr>
-        <w:tc>
-          <w:tcPr>
-            <w:tcW w:type="dxa" w:w="5040"/>
-            <w:shd w:val="clear" w:color="auto" w:fill="F2F6FC"/>
-          </w:tcPr>
-          <w:p>
-            <w:pPr>
-              <w:spacing w:after="40" w:before="40"/>
-            </w:pPr>
-            <w:r>
-              <w:rPr>
-                <w:rFonts w:ascii="Calibri" w:hAnsi="Calibri"/>
-                <w:b/>
-                <w:i w:val="0"/>
-                <w:color w:val="29457F"/>
-                <w:sz w:val="20"/>
-              </w:rPr>
-              <w:t>Test for interaction effects</w:t>
-            </w:r>
-          </w:p>
-        </w:tc>
-        <w:tc>
-          <w:tcPr>
-            <w:tcW w:type="dxa" w:w="1728"/>
-            <w:shd w:val="clear" w:color="auto" w:fill="F2F6FC"/>
-          </w:tcPr>
-          <w:p>
-            <w:pPr>
-              <w:spacing w:after="40" w:before="40"/>
-            </w:pPr>
-            <w:r>
-              <w:rPr>
-                <w:rFonts w:ascii="Calibri" w:hAnsi="Calibri"/>
-                <w:b w:val="0"/>
-                <w:i w:val="0"/>
-                <w:color w:val="1B2A45"/>
-                <w:sz w:val="19"/>
-              </w:rPr>
-              <w:t>S7, A1, A4</w:t>
-            </w:r>
-          </w:p>
-        </w:tc>
-        <w:tc>
-          <w:tcPr>
-            <w:tcW w:type="dxa" w:w="5904"/>
-            <w:shd w:val="clear" w:color="auto" w:fill="F2F6FC"/>
-          </w:tcPr>
-          <w:p>
-            <w:pPr>
-              <w:spacing w:after="40" w:before="40"/>
-            </w:pPr>
-            <w:r>
-              <w:rPr>
-                <w:rFonts w:ascii="Calibri" w:hAnsi="Calibri"/>
-                <w:b w:val="0"/>
-                <w:i w:val="0"/>
-                <w:color w:val="1B2A45"/>
-                <w:sz w:val="19"/>
-              </w:rPr>
-              <w:t>condition×category term; category-level effect varies 0→100 pp.</w:t>
+              <w:t>Paired A/B effect-size model for SORRY-Bench compliance.</w:t>
             </w:r>
           </w:p>
         </w:tc>
@@ -2192,7 +2065,7 @@
                 <w:color w:val="1B2A45"/>
                 <w:sz w:val="19"/>
               </w:rPr>
-              <w:t>S8, A2</w:t>
+              <w:t>S8, A1</w:t>
             </w:r>
           </w:p>
         </w:tc>
@@ -2256,7 +2129,7 @@
                 <w:color w:val="1B2A45"/>
                 <w:sz w:val="19"/>
               </w:rPr>
-              <w:t>S8, A2</w:t>
+              <w:t>S8, A1</w:t>
             </w:r>
           </w:p>
         </w:tc>
@@ -2339,7 +2212,7 @@
                 <w:color w:val="1B2A45"/>
                 <w:sz w:val="19"/>
               </w:rPr>
-              <w:t>Δ estimate, McNemar, CIs in Python; GLM predicts per-category compliance.</w:t>
+              <w:t>Δ estimate, McNemar, CIs computed in Python.</w:t>
             </w:r>
           </w:p>
         </w:tc>
@@ -2510,7 +2383,7 @@
                 <w:color w:val="1B2A45"/>
                 <w:sz w:val="19"/>
               </w:rPr>
-              <w:t>S10, A2</w:t>
+              <w:t>S10, A1</w:t>
             </w:r>
           </w:p>
         </w:tc>
@@ -2573,7 +2446,7 @@
                 <w:color w:val="1B2A45"/>
                 <w:sz w:val="19"/>
               </w:rPr>
-              <w:t>S11, A4</w:t>
+              <w:t>S11, A3</w:t>
             </w:r>
           </w:p>
         </w:tc>
@@ -2888,7 +2761,7 @@
           <w:color w:val="29457F"/>
           <w:sz w:val="24"/>
         </w:rPr>
-        <w:t>Statistical model, matrix form &amp; interactions</w:t>
+        <w:t>Effect size &amp; paired design</w:t>
       </w:r>
     </w:p>
     <w:p>
@@ -2913,7 +2786,7 @@
           <w:color w:val="29457F"/>
           <w:sz w:val="22"/>
         </w:rPr>
-        <w:t>Write down your statistical model.</w:t>
+        <w:t>How do you define the effect size?</w:t>
       </w:r>
     </w:p>
     <w:p>
@@ -2938,7 +2811,7 @@
           <w:color w:val="1B2A45"/>
           <w:sz w:val="22"/>
         </w:rPr>
-        <w:t>logit P(Yᵢ=1) = β₀ + β₁·edited + Σγ_c·catᵢ + Σδ_c·(edited×catᵢ). β₁ is the edit effect; a linear-probability version gives β₁ = Δ directly. McNemar/Δ are the focused, assumption-light version of β₁.</w:t>
+        <w:t>Per prompt, the signed change Dᵢ = Y_edited − Y_baseline ∈ {−1, 0, +1}; the effect size is Δ = mean(Dᵢ), the compliance-rate change. It comes straight from the flips: (247 − 4)/440 = +55.2 pp.</w:t>
       </w:r>
     </w:p>
     <w:p>
@@ -2963,7 +2836,7 @@
           <w:color w:val="29457F"/>
           <w:sz w:val="22"/>
         </w:rPr>
-        <w:t>Where is the matrix formulation?</w:t>
+        <w:t>Why does pairing matter here?</w:t>
       </w:r>
     </w:p>
     <w:p>
@@ -2988,57 +2861,7 @@
           <w:color w:val="1B2A45"/>
           <w:sz w:val="22"/>
         </w:rPr>
-        <w:t>η = Xβ. X has 880 rows (prompt×condition) and columns: intercept, condition indicator, 43 category dummies, and condition×category. Paired rows share category dummies; only the condition columns flip (appendix A1).</w:t>
-      </w:r>
-    </w:p>
-    <w:p>
-      <w:pPr>
-        <w:spacing w:before="60" w:after="20" w:line="269" w:lineRule="auto"/>
-      </w:pPr>
-      <w:r>
-        <w:rPr>
-          <w:rFonts w:ascii="Calibri" w:hAnsi="Calibri"/>
-          <w:b/>
-          <w:i w:val="0"/>
-          <w:color w:val="C7672C"/>
-          <w:sz w:val="22"/>
-        </w:rPr>
-        <w:t xml:space="preserve">Q.  </w:t>
-      </w:r>
-      <w:r>
-        <w:rPr>
-          <w:rFonts w:ascii="Calibri" w:hAnsi="Calibri"/>
-          <w:b/>
-          <w:i w:val="0"/>
-          <w:color w:val="29457F"/>
-          <w:sz w:val="22"/>
-        </w:rPr>
-        <w:t>What interaction did you test, and what did you find?</w:t>
-      </w:r>
-    </w:p>
-    <w:p>
-      <w:pPr>
-        <w:spacing w:before="0" w:after="60" w:line="278" w:lineRule="auto"/>
-      </w:pPr>
-      <w:r>
-        <w:rPr>
-          <w:rFonts w:ascii="Calibri" w:hAnsi="Calibri"/>
-          <w:b/>
-          <w:i w:val="0"/>
-          <w:color w:val="6A7890"/>
-          <w:sz w:val="22"/>
-        </w:rPr>
-        <w:t xml:space="preserve">A.  </w:t>
-      </w:r>
-      <w:r>
-        <w:rPr>
-          <w:rFonts w:ascii="Calibri" w:hAnsi="Calibri"/>
-          <w:b w:val="0"/>
-          <w:i w:val="0"/>
-          <w:color w:val="1B2A45"/>
-          <w:sz w:val="22"/>
-        </w:rPr>
-        <w:t>Condition×category. The category-level plot IS that interaction: the edit effect ranges from ~0 to +100 pp across categories. With only 10 prompts/category we treat it as exploratory error analysis, not 44 confirmatory tests.</w:t>
+        <w:t>Both models answer the same prompt, so each prompt is its own control — prompt difficulty, category mix and judge wording cancel out. That's why we test the discordant pairs with McNemar rather than comparing two independent samples.</w:t>
       </w:r>
     </w:p>
     <w:p>
@@ -4118,7 +3941,7 @@
           <w:color w:val="1B2A45"/>
           <w:sz w:val="22"/>
         </w:rPr>
-        <w:t>Inference: the statistical model and matrix/GLM formulation, interaction effects, assumptions and how they're checked, parametric vs non-parametric tests, and why McNemar.</w:t>
+        <w:t>Inference: the paired effect-size definition (signed change and Δ), model assumptions and how they're checked, parametric vs non-parametric tests, and why McNemar.</w:t>
       </w:r>
     </w:p>
     <w:p>

</xml_diff>